<commit_message>
Tuned up handling of random probe directions
</commit_message>
<xml_diff>
--- a/ Notes/Kernel Concepts.docx
+++ b/ Notes/Kernel Concepts.docx
@@ -14,6 +14,57 @@
           <w:b/>
           <w:bCs/>
         </w:rPr>
+        <w:t>Kernel Scaling:</w:t>
+      </w:r>
+    </w:p>
+    <w:p>
+      <w:pPr>
+        <w:rPr>
+          <w:b/>
+          <w:bCs/>
+        </w:rPr>
+      </w:pPr>
+    </w:p>
+    <w:p>
+      <w:r>
+        <w:t xml:space="preserve">If kernel noise always stays within a linear range of the decision variable (DV), then the amplitude of the measured delta-means kernel scales with the variance of the noise. </w:t>
+      </w:r>
+    </w:p>
+    <w:p/>
+    <w:p>
+      <w:r>
+        <w:t>This is because increasing the noise by a factor x scales the kernel by that factor.  But the behavioral impact of the noise also increases by the same factor, so the total effect of scaling the noise amplitude is to scale the kernel by x</w:t>
+      </w:r>
+      <w:r>
+        <w:rPr>
+          <w:vertAlign w:val="superscript"/>
+        </w:rPr>
+        <w:t>2</w:t>
+      </w:r>
+      <w:r>
+        <w:t xml:space="preserve">.  Put another way, the kernel amplitude scales with the variance of the noise. </w:t>
+      </w:r>
+    </w:p>
+    <w:p/>
+    <w:p>
+      <w:r>
+        <w:t>For this reason, we want to keep the preferred and probe noise matched for variance to make the scaling simple.</w:t>
+      </w:r>
+    </w:p>
+    <w:p/>
+    <w:p/>
+    <w:p>
+      <w:pPr>
+        <w:rPr>
+          <w:b/>
+          <w:bCs/>
+        </w:rPr>
+      </w:pPr>
+      <w:r>
+        <w:rPr>
+          <w:b/>
+          <w:bCs/>
+        </w:rPr>
         <w:t>Kernel Concepts:</w:t>
       </w:r>
     </w:p>
@@ -96,18 +147,7 @@
         </w:rPr>
         <w:br/>
       </w:r>
-      <w:r>
-        <w:rPr>
-          <w:b/>
-          <w:bCs/>
-        </w:rPr>
-        <w:br/>
-      </w:r>
-      <w:r>
-        <w:t>Switch from RF/Opp to L/R RDK kernels</w:t>
-      </w:r>
-    </w:p>
-    <w:p/>
+    </w:p>
     <w:p>
       <w:r>
         <w:rPr>

</xml_diff>